<commit_message>
Fix cross-validation values in appendix with actual notebook output
CV fold accuracies were incorrect (estimated). Replaced with real values
from notebook: [0.9146, 0.9182, 0.9084, 0.9152, 0.9168], mean 0.9146
+/- 0.0034.
</commit_message>
<xml_diff>
--- a/thesis/FinalSubmission_JuanseMarcial_Draft6.docx
+++ b/thesis/FinalSubmission_JuanseMarcial_Draft6.docx
@@ -5410,45 +5410,7 @@
                 <w:sz w:val="22"/>
                 <w:rFonts w:ascii="Times New Roman" w:hAnsi="Times New Roman" w:cs="Times New Roman"/>
               </w:rPr>
-              <w:t>0.9220</w:t>
-            </w:r>
-          </w:p>
-        </w:tc>
-        <w:tc>
-          <w:tcPr>
-            <w:tcW w:type="dxa" w:w="1560"/>
-          </w:tcPr>
-          <w:p>
-            <w:pPr>
-              <w:jc w:val="center"/>
-            </w:pPr>
-            <w:r/>
-            <w:r>
-              <w:rPr>
-                <w:rFonts w:ascii="Times New Roman" w:hAnsi="Times New Roman"/>
-                <w:sz w:val="22"/>
-                <w:rFonts w:ascii="Times New Roman" w:hAnsi="Times New Roman" w:cs="Times New Roman"/>
-              </w:rPr>
-              <w:t>0.9210</w:t>
-            </w:r>
-          </w:p>
-        </w:tc>
-        <w:tc>
-          <w:tcPr>
-            <w:tcW w:type="dxa" w:w="1560"/>
-          </w:tcPr>
-          <w:p>
-            <w:pPr>
-              <w:jc w:val="center"/>
-            </w:pPr>
-            <w:r/>
-            <w:r>
-              <w:rPr>
-                <w:rFonts w:ascii="Times New Roman" w:hAnsi="Times New Roman"/>
-                <w:sz w:val="22"/>
-                <w:rFonts w:ascii="Times New Roman" w:hAnsi="Times New Roman" w:cs="Times New Roman"/>
-              </w:rPr>
-              <w:t>0.9192</w:t>
+              <w:t>0.9146</w:t>
             </w:r>
           </w:p>
         </w:tc>
@@ -5468,6 +5430,44 @@
                 <w:rFonts w:ascii="Times New Roman" w:hAnsi="Times New Roman" w:cs="Times New Roman"/>
               </w:rPr>
               <w:t>0.9182</w:t>
+            </w:r>
+          </w:p>
+        </w:tc>
+        <w:tc>
+          <w:tcPr>
+            <w:tcW w:type="dxa" w:w="1560"/>
+          </w:tcPr>
+          <w:p>
+            <w:pPr>
+              <w:jc w:val="center"/>
+            </w:pPr>
+            <w:r/>
+            <w:r>
+              <w:rPr>
+                <w:rFonts w:ascii="Times New Roman" w:hAnsi="Times New Roman"/>
+                <w:sz w:val="22"/>
+                <w:rFonts w:ascii="Times New Roman" w:hAnsi="Times New Roman" w:cs="Times New Roman"/>
+              </w:rPr>
+              <w:t>0.9084</w:t>
+            </w:r>
+          </w:p>
+        </w:tc>
+        <w:tc>
+          <w:tcPr>
+            <w:tcW w:type="dxa" w:w="1560"/>
+          </w:tcPr>
+          <w:p>
+            <w:pPr>
+              <w:jc w:val="center"/>
+            </w:pPr>
+            <w:r/>
+            <w:r>
+              <w:rPr>
+                <w:rFonts w:ascii="Times New Roman" w:hAnsi="Times New Roman"/>
+                <w:sz w:val="22"/>
+                <w:rFonts w:ascii="Times New Roman" w:hAnsi="Times New Roman" w:cs="Times New Roman"/>
+              </w:rPr>
+              <w:t>0.9152</w:t>
             </w:r>
           </w:p>
         </w:tc>
@@ -5527,7 +5527,7 @@
                 <w:sz w:val="22"/>
                 <w:rFonts w:ascii="Times New Roman" w:hAnsi="Times New Roman" w:cs="Times New Roman"/>
               </w:rPr>
-              <w:t>0.9194 ± 0.0020</w:t>
+              <w:t>0.9146 ± 0.0034</w:t>
             </w:r>
           </w:p>
         </w:tc>
@@ -5547,7 +5547,7 @@
           <w:sz w:val="24"/>
           <w:rFonts w:ascii="Times New Roman" w:hAnsi="Times New Roman" w:cs="Times New Roman"/>
         </w:rPr>
-        <w:t>The narrow standard deviation (0.0020) across folds confirms that the model generalises consistently and is not overly sensitive to the particular training partition. The fold level accuracies range from 91.68% to 92.20%, a spread of only 0.52 percentage points. This stability supports the conclusion that the 91.58% test set accuracy reported in the main text is representative of the model's true generalisation performance rather than an artefact of a fortunate train test split.</w:t>
+        <w:t>The narrow standard deviation (0.0034) across folds confirms that the model generalises consistently and is not overly sensitive to the particular training partition. The fold level accuracies range from 90.84% to 91.82%, a spread of less than one percentage point. This stability supports the conclusion that the 91.58% test set accuracy reported in the main text is representative of the model's true generalisation performance rather than an artefact of a fortunate train test split.</w:t>
       </w:r>
     </w:p>
     <w:p>

</xml_diff>